<commit_message>
Lab6: replace manual TOC with a real Word TOC field (indexation)
</commit_message>
<xml_diff>
--- a/Lab6/Lab6_PlesuDinu_FAF-241.docx
+++ b/Lab6/Lab6_PlesuDinu_FAF-241.docx
@@ -232,51 +232,69 @@
     </w:p>
     <w:p>
       <w:pPr>
-        <w:spacing w:after="80"/>
-      </w:pPr>
-      <w:r>
+        <w:spacing w:after="130"/>
+      </w:pPr>
+      <w:r>
+        <w:fldChar w:fldCharType="begin" w:dirty="true"/>
+      </w:r>
+      <w:r>
+        <w:instrText xml:space="preserve"> TOC \o "1-2" \h \z \u </w:instrText>
+      </w:r>
+      <w:r>
+        <w:fldChar w:fldCharType="separate"/>
+      </w:r>
+      <w:r>
+        <w:rPr/>
         <w:t>1.  Purpose of the Work</w:t>
       </w:r>
     </w:p>
     <w:p>
       <w:pPr>
-        <w:spacing w:after="80"/>
-      </w:pPr>
-      <w:r>
+        <w:spacing w:after="130"/>
+      </w:pPr>
+      <w:r>
+        <w:rPr/>
         <w:t>2.  Part 1 – Read what xv6 shows you</w:t>
       </w:r>
     </w:p>
     <w:p>
       <w:pPr>
-        <w:spacing w:after="80"/>
-      </w:pPr>
-      <w:r>
+        <w:spacing w:after="130"/>
+      </w:pPr>
+      <w:r>
+        <w:rPr/>
         <w:t>3.  Part 2 – Write mystat</w:t>
       </w:r>
     </w:p>
     <w:p>
       <w:pPr>
-        <w:spacing w:after="80"/>
-      </w:pPr>
-      <w:r>
+        <w:spacing w:after="130"/>
+      </w:pPr>
+      <w:r>
+        <w:rPr/>
         <w:t>4.  Part 3 – Measure the limits</w:t>
       </w:r>
     </w:p>
     <w:p>
       <w:pPr>
-        <w:spacing w:after="80"/>
-      </w:pPr>
-      <w:r>
+        <w:spacing w:after="130"/>
+      </w:pPr>
+      <w:r>
+        <w:rPr/>
         <w:t>5.  Part 4 – Write find</w:t>
       </w:r>
     </w:p>
     <w:p>
       <w:pPr>
-        <w:spacing w:after="80"/>
-      </w:pPr>
-      <w:r>
+        <w:spacing w:after="130"/>
+      </w:pPr>
+      <w:r>
+        <w:rPr/>
         <w:t>6.  Conclusion</w:t>
       </w:r>
+      <w:r>
+        <w:fldChar w:fldCharType="end"/>
+      </w:r>
     </w:p>
     <w:p>
       <w:r>
@@ -284,6 +302,7 @@
       </w:r>
     </w:p>
     <w:p>
+      <w:bookmarkStart w:id="1001" w:name="_Toc1001"/>
       <w:pPr>
         <w:pStyle w:val="Heading1"/>
       </w:pPr>
@@ -293,6 +312,7 @@
         </w:rPr>
         <w:t>1.  Purpose of the Work</w:t>
       </w:r>
+      <w:bookmarkEnd w:id="1001"/>
     </w:p>
     <w:p>
       <w:pPr>
@@ -327,6 +347,7 @@
       </w:r>
     </w:p>
     <w:p>
+      <w:bookmarkStart w:id="1002" w:name="_Toc1002"/>
       <w:pPr>
         <w:pStyle w:val="Heading1"/>
       </w:pPr>
@@ -336,6 +357,7 @@
         </w:rPr>
         <w:t>2.  Part 1 – Read what xv6 shows you</w:t>
       </w:r>
+      <w:bookmarkEnd w:id="1002"/>
     </w:p>
     <w:p>
       <w:pPr>
@@ -464,6 +486,7 @@
       </w:r>
     </w:p>
     <w:p>
+      <w:bookmarkStart w:id="1003" w:name="_Toc1003"/>
       <w:pPr>
         <w:pStyle w:val="Heading2"/>
       </w:pPr>
@@ -473,6 +496,7 @@
         </w:rPr>
         <w:t>2.1.  Observations</w:t>
       </w:r>
+      <w:bookmarkEnd w:id="1003"/>
     </w:p>
     <w:p>
       <w:pPr>
@@ -499,6 +523,7 @@
       </w:r>
     </w:p>
     <w:p>
+      <w:bookmarkStart w:id="1004" w:name="_Toc1004"/>
       <w:pPr>
         <w:pStyle w:val="Heading1"/>
       </w:pPr>
@@ -508,6 +533,7 @@
         </w:rPr>
         <w:t>3.  Part 2 – Write mystat</w:t>
       </w:r>
+      <w:bookmarkEnd w:id="1004"/>
     </w:p>
     <w:p>
       <w:pPr>
@@ -785,6 +811,7 @@
       </w:r>
     </w:p>
     <w:p>
+      <w:bookmarkStart w:id="1005" w:name="_Toc1005"/>
       <w:pPr>
         <w:pStyle w:val="Heading2"/>
       </w:pPr>
@@ -794,6 +821,7 @@
         </w:rPr>
         <w:t>3.1.  Observations</w:t>
       </w:r>
+      <w:bookmarkEnd w:id="1005"/>
     </w:p>
     <w:p>
       <w:pPr>
@@ -820,6 +848,7 @@
       </w:r>
     </w:p>
     <w:p>
+      <w:bookmarkStart w:id="1006" w:name="_Toc1006"/>
       <w:pPr>
         <w:pStyle w:val="Heading1"/>
       </w:pPr>
@@ -829,6 +858,7 @@
         </w:rPr>
         <w:t>4.  Part 3 – Measure the limits</w:t>
       </w:r>
+      <w:bookmarkEnd w:id="1006"/>
     </w:p>
     <w:p>
       <w:pPr>
@@ -965,6 +995,7 @@
       </w:r>
     </w:p>
     <w:p>
+      <w:bookmarkStart w:id="1007" w:name="_Toc1007"/>
       <w:pPr>
         <w:pStyle w:val="Heading2"/>
       </w:pPr>
@@ -974,6 +1005,7 @@
         </w:rPr>
         <w:t>4.1.  Observations</w:t>
       </w:r>
+      <w:bookmarkEnd w:id="1007"/>
     </w:p>
     <w:p>
       <w:pPr>
@@ -1000,6 +1032,7 @@
       </w:r>
     </w:p>
     <w:p>
+      <w:bookmarkStart w:id="1008" w:name="_Toc1008"/>
       <w:pPr>
         <w:pStyle w:val="Heading1"/>
       </w:pPr>
@@ -1009,6 +1042,7 @@
         </w:rPr>
         <w:t>5.  Part 4 – Write find</w:t>
       </w:r>
+      <w:bookmarkEnd w:id="1008"/>
     </w:p>
     <w:p>
       <w:pPr>
@@ -1239,6 +1273,7 @@
       </w:r>
     </w:p>
     <w:p>
+      <w:bookmarkStart w:id="1009" w:name="_Toc1009"/>
       <w:pPr>
         <w:pStyle w:val="Heading2"/>
       </w:pPr>
@@ -1248,6 +1283,7 @@
         </w:rPr>
         <w:t>5.1.  Observations</w:t>
       </w:r>
+      <w:bookmarkEnd w:id="1009"/>
     </w:p>
     <w:p>
       <w:pPr>
@@ -1266,6 +1302,7 @@
       </w:r>
     </w:p>
     <w:p>
+      <w:bookmarkStart w:id="1010" w:name="_Toc1010"/>
       <w:pPr>
         <w:pStyle w:val="Heading1"/>
       </w:pPr>
@@ -1275,6 +1312,7 @@
         </w:rPr>
         <w:t>6.  Conclusion</w:t>
       </w:r>
+      <w:bookmarkEnd w:id="1010"/>
     </w:p>
     <w:p>
       <w:pPr>

</xml_diff>